<commit_message>
media: Update CV documents to latest versions.
</commit_message>
<xml_diff>
--- a/assets/docs/cv-vassili-regnier.docx
+++ b/assets/docs/cv-vassili-regnier.docx
@@ -254,35 +254,28 @@
           <w:sz w:val="22"/>
           <w:szCs w:val="22"/>
         </w:rPr>
-        <w:t xml:space="preserve">Recherche alternance Ingénieur </w:t>
-      </w:r>
-      <w:r>
-        <w:rPr>
-          <w:sz w:val="22"/>
-          <w:szCs w:val="22"/>
-        </w:rPr>
-        <w:t>L</w:t>
-      </w:r>
-      <w:r>
-        <w:rPr>
-          <w:sz w:val="22"/>
-          <w:szCs w:val="22"/>
-        </w:rPr>
-        <w:t>ogiciel (</w:t>
-      </w:r>
-      <w:r>
-        <w:rPr>
-          <w:sz w:val="22"/>
-          <w:szCs w:val="22"/>
-        </w:rPr>
-        <w:t>Architecture &amp; Bas-Niveau</w:t>
-      </w:r>
-      <w:r>
-        <w:rPr>
-          <w:sz w:val="22"/>
-          <w:szCs w:val="22"/>
-        </w:rPr>
-        <w:t>)</w:t>
+        <w:t>Recherche alternance</w:t>
+      </w:r>
+      <w:r>
+        <w:rPr>
+          <w:sz w:val="22"/>
+          <w:szCs w:val="22"/>
+        </w:rPr>
+        <w:t xml:space="preserve"> –</w:t>
+      </w:r>
+      <w:r>
+        <w:rPr>
+          <w:sz w:val="22"/>
+          <w:szCs w:val="22"/>
+        </w:rPr>
+        <w:t xml:space="preserve"> Ingénieur </w:t>
+      </w:r>
+      <w:r>
+        <w:rPr>
+          <w:sz w:val="22"/>
+          <w:szCs w:val="22"/>
+        </w:rPr>
+        <w:t>Développement Systèmes Embarqués</w:t>
       </w:r>
     </w:p>
     <w:p>
@@ -535,6 +528,7 @@
         <w:t xml:space="preserve">                     </w:t>
       </w:r>
       <w:hyperlink r:id="rId16" w:history="1">
+        <w:proofErr w:type="spellStart"/>
         <w:r>
           <w:rPr>
             <w:rStyle w:val="Lienhypertexte"/>
@@ -543,6 +537,7 @@
           </w:rPr>
           <w:t>vassiliregnier.dev</w:t>
         </w:r>
+        <w:proofErr w:type="spellEnd"/>
       </w:hyperlink>
     </w:p>
     <w:p>
@@ -581,6 +576,7 @@
         <w:t xml:space="preserve">                     </w:t>
       </w:r>
       <w:hyperlink r:id="rId18" w:history="1">
+        <w:proofErr w:type="spellStart"/>
         <w:r>
           <w:rPr>
             <w:rStyle w:val="Lienhypertexte"/>
@@ -589,6 +585,7 @@
           </w:rPr>
           <w:t>vassili-regnier</w:t>
         </w:r>
+        <w:proofErr w:type="spellEnd"/>
       </w:hyperlink>
       <w:r>
         <w:rPr>
@@ -984,12 +981,21 @@
           <w:szCs w:val="22"/>
         </w:rPr>
       </w:pPr>
-      <w:r>
-        <w:rPr>
-          <w:sz w:val="22"/>
-          <w:szCs w:val="22"/>
-        </w:rPr>
-        <w:t>Reporting pr</w:t>
+      <w:proofErr w:type="spellStart"/>
+      <w:r>
+        <w:rPr>
+          <w:sz w:val="22"/>
+          <w:szCs w:val="22"/>
+        </w:rPr>
+        <w:t>Reporting</w:t>
+      </w:r>
+      <w:proofErr w:type="spellEnd"/>
+      <w:r>
+        <w:rPr>
+          <w:sz w:val="22"/>
+          <w:szCs w:val="22"/>
+        </w:rPr>
+        <w:t xml:space="preserve"> pr</w:t>
       </w:r>
       <w:r>
         <w:rPr>
@@ -1554,7 +1560,23 @@
           <w:b/>
           <w:bCs/>
         </w:rPr>
-        <w:t xml:space="preserve">CONTRIBUTION OPEN SOURCE – Starship     </w:t>
+        <w:t xml:space="preserve">CONTRIBUTION OPEN SOURCE – </w:t>
+      </w:r>
+      <w:proofErr w:type="spellStart"/>
+      <w:r>
+        <w:rPr>
+          <w:b/>
+          <w:bCs/>
+        </w:rPr>
+        <w:t>Starship</w:t>
+      </w:r>
+      <w:proofErr w:type="spellEnd"/>
+      <w:r>
+        <w:rPr>
+          <w:b/>
+          <w:bCs/>
+        </w:rPr>
+        <w:t xml:space="preserve">     </w:t>
       </w:r>
       <w:r>
         <w:rPr>
@@ -1584,7 +1606,27 @@
           <w:sz w:val="20"/>
           <w:szCs w:val="20"/>
         </w:rPr>
-        <w:t>it | Cross-platform | Tests d’intégration</w:t>
+        <w:t>it | Cross-</w:t>
+      </w:r>
+      <w:r>
+        <w:rPr>
+          <w:i/>
+          <w:iCs/>
+          <w:color w:val="156082" w:themeColor="accent1"/>
+          <w:sz w:val="20"/>
+          <w:szCs w:val="20"/>
+        </w:rPr>
+        <w:t xml:space="preserve">platform </w:t>
+      </w:r>
+      <w:r>
+        <w:rPr>
+          <w:i/>
+          <w:iCs/>
+          <w:color w:val="0B769F" w:themeColor="accent4" w:themeShade="BF"/>
+          <w:sz w:val="20"/>
+          <w:szCs w:val="20"/>
+        </w:rPr>
+        <w:t>| Tests d’intégration</w:t>
       </w:r>
       <w:r>
         <w:rPr>
@@ -1761,7 +1803,239 @@
           <w:sz w:val="22"/>
           <w:szCs w:val="22"/>
         </w:rPr>
-        <w:t>: refactoring, code review et respect des standards de production.</w:t>
+        <w:t xml:space="preserve">: </w:t>
+      </w:r>
+      <w:proofErr w:type="spellStart"/>
+      <w:r>
+        <w:rPr>
+          <w:sz w:val="22"/>
+          <w:szCs w:val="22"/>
+        </w:rPr>
+        <w:t>refactoring</w:t>
+      </w:r>
+      <w:proofErr w:type="spellEnd"/>
+      <w:r>
+        <w:rPr>
+          <w:sz w:val="22"/>
+          <w:szCs w:val="22"/>
+        </w:rPr>
+        <w:t xml:space="preserve">, code </w:t>
+      </w:r>
+      <w:proofErr w:type="spellStart"/>
+      <w:r>
+        <w:rPr>
+          <w:sz w:val="22"/>
+          <w:szCs w:val="22"/>
+        </w:rPr>
+        <w:t>review</w:t>
+      </w:r>
+      <w:proofErr w:type="spellEnd"/>
+      <w:r>
+        <w:rPr>
+          <w:sz w:val="22"/>
+          <w:szCs w:val="22"/>
+        </w:rPr>
+        <w:t xml:space="preserve"> et respect des standards de production.</w:t>
+      </w:r>
+    </w:p>
+    <w:p>
+      <w:pPr>
+        <w:tabs>
+          <w:tab w:val="left" w:pos="1560"/>
+          <w:tab w:val="left" w:pos="9356"/>
+        </w:tabs>
+        <w:spacing w:before="60" w:after="60"/>
+        <w:rPr>
+          <w:b/>
+          <w:bCs/>
+          <w:color w:val="808080" w:themeColor="background1" w:themeShade="80"/>
+          <w:sz w:val="22"/>
+          <w:szCs w:val="22"/>
+        </w:rPr>
+      </w:pPr>
+      <w:r>
+        <w:rPr>
+          <w:b/>
+          <w:bCs/>
+        </w:rPr>
+        <w:t>SUDOKU CLI</w:t>
+      </w:r>
+      <w:r>
+        <w:rPr>
+          <w:b/>
+          <w:bCs/>
+          <w:color w:val="156082" w:themeColor="accent1"/>
+        </w:rPr>
+        <w:tab/>
+        <w:t xml:space="preserve"> </w:t>
+      </w:r>
+      <w:r>
+        <w:rPr>
+          <w:i/>
+          <w:iCs/>
+          <w:color w:val="0B769F" w:themeColor="accent4" w:themeShade="BF"/>
+          <w:sz w:val="20"/>
+          <w:szCs w:val="20"/>
+        </w:rPr>
+        <w:t xml:space="preserve">Fiabilité | Maintenabilité | </w:t>
+      </w:r>
+      <w:r>
+        <w:rPr>
+          <w:i/>
+          <w:iCs/>
+          <w:color w:val="0B769F" w:themeColor="accent4" w:themeShade="BF"/>
+          <w:sz w:val="20"/>
+          <w:szCs w:val="20"/>
+        </w:rPr>
+        <w:t xml:space="preserve">Clang | GCC | </w:t>
+      </w:r>
+      <w:proofErr w:type="spellStart"/>
+      <w:r>
+        <w:rPr>
+          <w:i/>
+          <w:iCs/>
+          <w:color w:val="0B769F" w:themeColor="accent4" w:themeShade="BF"/>
+          <w:sz w:val="20"/>
+          <w:szCs w:val="20"/>
+        </w:rPr>
+        <w:t>CMake</w:t>
+      </w:r>
+      <w:proofErr w:type="spellEnd"/>
+      <w:r>
+        <w:rPr>
+          <w:sz w:val="22"/>
+          <w:szCs w:val="22"/>
+        </w:rPr>
+        <w:tab/>
+      </w:r>
+      <w:r>
+        <w:rPr>
+          <w:b/>
+          <w:bCs/>
+          <w:color w:val="808080" w:themeColor="background1" w:themeShade="80"/>
+          <w:sz w:val="22"/>
+          <w:szCs w:val="22"/>
+        </w:rPr>
+        <w:t>C++</w:t>
+      </w:r>
+    </w:p>
+    <w:p>
+      <w:pPr>
+        <w:pStyle w:val="Paragraphedeliste"/>
+        <w:numPr>
+          <w:ilvl w:val="0"/>
+          <w:numId w:val="3"/>
+        </w:numPr>
+        <w:tabs>
+          <w:tab w:val="left" w:pos="7230"/>
+          <w:tab w:val="left" w:pos="9356"/>
+        </w:tabs>
+        <w:spacing w:before="60" w:after="60"/>
+        <w:rPr>
+          <w:sz w:val="22"/>
+          <w:szCs w:val="22"/>
+        </w:rPr>
+      </w:pPr>
+      <w:r>
+        <w:rPr>
+          <w:sz w:val="22"/>
+          <w:szCs w:val="22"/>
+        </w:rPr>
+        <w:t>Développement d’un moteur Sudoku en C++ modern</w:t>
+      </w:r>
+      <w:r>
+        <w:rPr>
+          <w:sz w:val="22"/>
+          <w:szCs w:val="22"/>
+        </w:rPr>
+        <w:t>e</w:t>
+      </w:r>
+      <w:r>
+        <w:rPr>
+          <w:sz w:val="22"/>
+          <w:szCs w:val="22"/>
+        </w:rPr>
+        <w:t xml:space="preserve">. </w:t>
+      </w:r>
+      <w:r>
+        <w:rPr>
+          <w:sz w:val="22"/>
+          <w:szCs w:val="22"/>
+        </w:rPr>
+        <w:t>API Publique claire.</w:t>
+      </w:r>
+    </w:p>
+    <w:p>
+      <w:pPr>
+        <w:pStyle w:val="Paragraphedeliste"/>
+        <w:numPr>
+          <w:ilvl w:val="0"/>
+          <w:numId w:val="3"/>
+        </w:numPr>
+        <w:tabs>
+          <w:tab w:val="left" w:pos="7230"/>
+          <w:tab w:val="left" w:pos="9356"/>
+        </w:tabs>
+        <w:spacing w:before="60" w:after="60"/>
+        <w:rPr>
+          <w:sz w:val="22"/>
+          <w:szCs w:val="22"/>
+        </w:rPr>
+      </w:pPr>
+      <w:r>
+        <w:rPr>
+          <w:sz w:val="22"/>
+          <w:szCs w:val="22"/>
+        </w:rPr>
+        <w:t xml:space="preserve">Architecture modulaire : </w:t>
+      </w:r>
+      <w:proofErr w:type="spellStart"/>
+      <w:r>
+        <w:rPr>
+          <w:sz w:val="22"/>
+          <w:szCs w:val="22"/>
+        </w:rPr>
+        <w:t>core</w:t>
+      </w:r>
+      <w:proofErr w:type="spellEnd"/>
+      <w:r>
+        <w:rPr>
+          <w:sz w:val="22"/>
+          <w:szCs w:val="22"/>
+        </w:rPr>
+        <w:t xml:space="preserve"> métier sans I/O, interface CLI découplée.</w:t>
+      </w:r>
+    </w:p>
+    <w:p>
+      <w:pPr>
+        <w:pStyle w:val="Paragraphedeliste"/>
+        <w:numPr>
+          <w:ilvl w:val="0"/>
+          <w:numId w:val="3"/>
+        </w:numPr>
+        <w:tabs>
+          <w:tab w:val="left" w:pos="7230"/>
+          <w:tab w:val="left" w:pos="9356"/>
+        </w:tabs>
+        <w:spacing w:before="60" w:after="60"/>
+        <w:rPr>
+          <w:sz w:val="22"/>
+          <w:szCs w:val="22"/>
+        </w:rPr>
+      </w:pPr>
+      <w:r>
+        <w:rPr>
+          <w:sz w:val="22"/>
+          <w:szCs w:val="22"/>
+        </w:rPr>
+        <w:t>Démarche qualité complète : tests unitaires, analyse statique, formatage</w:t>
+      </w:r>
+      <w:r>
+        <w:rPr>
+          <w:sz w:val="22"/>
+          <w:szCs w:val="22"/>
+        </w:rPr>
+        <w:t>, sanitizer.</w:t>
       </w:r>
     </w:p>
     <w:p>
@@ -2035,6 +2309,7 @@
       <w:r>
         <w:t xml:space="preserve">     </w:t>
       </w:r>
+      <w:proofErr w:type="spellStart"/>
       <w:r>
         <w:rPr>
           <w:i/>
@@ -2043,8 +2318,9 @@
           <w:sz w:val="20"/>
           <w:szCs w:val="20"/>
         </w:rPr>
-        <w:t>Architecture hexagonale</w:t>
-      </w:r>
+        <w:t>Architecture</w:t>
+      </w:r>
+      <w:proofErr w:type="spellEnd"/>
       <w:r>
         <w:rPr>
           <w:i/>
@@ -2053,7 +2329,27 @@
           <w:sz w:val="20"/>
           <w:szCs w:val="20"/>
         </w:rPr>
+        <w:t xml:space="preserve"> hexagonale</w:t>
+      </w:r>
+      <w:r>
+        <w:rPr>
+          <w:i/>
+          <w:iCs/>
+          <w:color w:val="0B769F" w:themeColor="accent4" w:themeShade="BF"/>
+          <w:sz w:val="20"/>
+          <w:szCs w:val="20"/>
+        </w:rPr>
         <w:t xml:space="preserve"> | CQS |</w:t>
+      </w:r>
+      <w:r>
+        <w:rPr>
+          <w:i/>
+          <w:iCs/>
+          <w:color w:val="0B769F" w:themeColor="accent4" w:themeShade="BF"/>
+          <w:sz w:val="20"/>
+          <w:szCs w:val="20"/>
+        </w:rPr>
+        <w:t xml:space="preserve"> </w:t>
       </w:r>
       <w:r>
         <w:rPr>
@@ -2133,334 +2429,6 @@
           <w:szCs w:val="22"/>
         </w:rPr>
         <w:t xml:space="preserve">. </w:t>
-      </w:r>
-    </w:p>
-    <w:p>
-      <w:pPr>
-        <w:pStyle w:val="Paragraphedeliste"/>
-        <w:numPr>
-          <w:ilvl w:val="0"/>
-          <w:numId w:val="3"/>
-        </w:numPr>
-        <w:tabs>
-          <w:tab w:val="left" w:pos="7230"/>
-        </w:tabs>
-        <w:spacing w:after="60"/>
-        <w:ind w:left="357" w:hanging="357"/>
-        <w:rPr>
-          <w:sz w:val="22"/>
-          <w:szCs w:val="22"/>
-        </w:rPr>
-      </w:pPr>
-      <w:r>
-        <w:rPr>
-          <w:sz w:val="22"/>
-          <w:szCs w:val="22"/>
-        </w:rPr>
-        <w:t>D</w:t>
-      </w:r>
-      <w:r>
-        <w:rPr>
-          <w:sz w:val="22"/>
-          <w:szCs w:val="22"/>
-        </w:rPr>
-        <w:t>esign patterns avanc</w:t>
-      </w:r>
-      <w:r>
-        <w:rPr>
-          <w:rFonts w:hint="cs"/>
-          <w:sz w:val="22"/>
-          <w:szCs w:val="22"/>
-        </w:rPr>
-        <w:t>é</w:t>
-      </w:r>
-      <w:r>
-        <w:rPr>
-          <w:sz w:val="22"/>
-          <w:szCs w:val="22"/>
-        </w:rPr>
-        <w:t>s : Ports &amp; Adapters, Command Bus et injection de d</w:t>
-      </w:r>
-      <w:r>
-        <w:rPr>
-          <w:rFonts w:hint="cs"/>
-          <w:sz w:val="22"/>
-          <w:szCs w:val="22"/>
-        </w:rPr>
-        <w:t>é</w:t>
-      </w:r>
-      <w:r>
-        <w:rPr>
-          <w:sz w:val="22"/>
-          <w:szCs w:val="22"/>
-        </w:rPr>
-        <w:t>pendance</w:t>
-      </w:r>
-      <w:r>
-        <w:rPr>
-          <w:sz w:val="22"/>
-          <w:szCs w:val="22"/>
-        </w:rPr>
-        <w:t>s</w:t>
-      </w:r>
-      <w:r>
-        <w:rPr>
-          <w:sz w:val="22"/>
-          <w:szCs w:val="22"/>
-        </w:rPr>
-        <w:t>.</w:t>
-      </w:r>
-    </w:p>
-    <w:p>
-      <w:pPr>
-        <w:tabs>
-          <w:tab w:val="left" w:pos="9356"/>
-        </w:tabs>
-        <w:rPr>
-          <w:sz w:val="20"/>
-          <w:szCs w:val="20"/>
-        </w:rPr>
-      </w:pPr>
-      <w:r>
-        <w:rPr>
-          <w:b/>
-          <w:bCs/>
-        </w:rPr>
-        <w:t>MATHEOPOLIS</w:t>
-      </w:r>
-      <w:r>
-        <w:t xml:space="preserve">     </w:t>
-      </w:r>
-      <w:r>
-        <w:rPr>
-          <w:i/>
-          <w:iCs/>
-          <w:color w:val="0B769F" w:themeColor="accent4" w:themeShade="BF"/>
-          <w:sz w:val="20"/>
-          <w:szCs w:val="20"/>
-        </w:rPr>
-        <w:t xml:space="preserve">Projet fin d’études (En cours) | </w:t>
-      </w:r>
-      <w:r>
-        <w:rPr>
-          <w:i/>
-          <w:iCs/>
-          <w:color w:val="0B769F" w:themeColor="accent4" w:themeShade="BF"/>
-          <w:sz w:val="20"/>
-          <w:szCs w:val="20"/>
-        </w:rPr>
-        <w:t>Sécurité</w:t>
-      </w:r>
-      <w:r>
-        <w:rPr>
-          <w:i/>
-          <w:iCs/>
-          <w:color w:val="0B769F" w:themeColor="accent4" w:themeShade="BF"/>
-          <w:sz w:val="20"/>
-          <w:szCs w:val="20"/>
-        </w:rPr>
-        <w:t xml:space="preserve"> | Architecture propre</w:t>
-      </w:r>
-      <w:r>
-        <w:rPr>
-          <w:i/>
-          <w:iCs/>
-          <w:color w:val="0B769F" w:themeColor="accent4" w:themeShade="BF"/>
-          <w:sz w:val="20"/>
-          <w:szCs w:val="20"/>
-        </w:rPr>
-        <w:tab/>
-      </w:r>
-      <w:r>
-        <w:rPr>
-          <w:b/>
-          <w:bCs/>
-          <w:color w:val="808080" w:themeColor="background1" w:themeShade="80"/>
-          <w:sz w:val="22"/>
-          <w:szCs w:val="22"/>
-        </w:rPr>
-        <w:t>PHP</w:t>
-      </w:r>
-    </w:p>
-    <w:p>
-      <w:pPr>
-        <w:pStyle w:val="Paragraphedeliste"/>
-        <w:numPr>
-          <w:ilvl w:val="0"/>
-          <w:numId w:val="3"/>
-        </w:numPr>
-        <w:tabs>
-          <w:tab w:val="left" w:pos="7230"/>
-        </w:tabs>
-        <w:rPr>
-          <w:sz w:val="22"/>
-          <w:szCs w:val="22"/>
-        </w:rPr>
-      </w:pPr>
-      <w:r>
-        <w:rPr>
-          <w:sz w:val="22"/>
-          <w:szCs w:val="22"/>
-        </w:rPr>
-        <w:t>Plateforme interactive math</w:t>
-      </w:r>
-      <w:r>
-        <w:rPr>
-          <w:rFonts w:hint="cs"/>
-          <w:sz w:val="22"/>
-          <w:szCs w:val="22"/>
-        </w:rPr>
-        <w:t>é</w:t>
-      </w:r>
-      <w:r>
-        <w:rPr>
-          <w:sz w:val="22"/>
-          <w:szCs w:val="22"/>
-        </w:rPr>
-        <w:t>matique destin</w:t>
-      </w:r>
-      <w:r>
-        <w:rPr>
-          <w:rFonts w:hint="cs"/>
-          <w:sz w:val="22"/>
-          <w:szCs w:val="22"/>
-        </w:rPr>
-        <w:t>é</w:t>
-      </w:r>
-      <w:r>
-        <w:rPr>
-          <w:sz w:val="22"/>
-          <w:szCs w:val="22"/>
-        </w:rPr>
-        <w:t xml:space="preserve">e </w:t>
-      </w:r>
-      <w:r>
-        <w:rPr>
-          <w:rFonts w:hint="cs"/>
-          <w:sz w:val="22"/>
-          <w:szCs w:val="22"/>
-        </w:rPr>
-        <w:t>à</w:t>
-      </w:r>
-      <w:r>
-        <w:rPr>
-          <w:sz w:val="22"/>
-          <w:szCs w:val="22"/>
-        </w:rPr>
-        <w:t xml:space="preserve"> des lyc</w:t>
-      </w:r>
-      <w:r>
-        <w:rPr>
-          <w:rFonts w:hint="cs"/>
-          <w:sz w:val="22"/>
-          <w:szCs w:val="22"/>
-        </w:rPr>
-        <w:t>é</w:t>
-      </w:r>
-      <w:r>
-        <w:rPr>
-          <w:sz w:val="22"/>
-          <w:szCs w:val="22"/>
-        </w:rPr>
-        <w:t xml:space="preserve">ens. </w:t>
-      </w:r>
-    </w:p>
-    <w:p>
-      <w:pPr>
-        <w:pStyle w:val="Paragraphedeliste"/>
-        <w:numPr>
-          <w:ilvl w:val="0"/>
-          <w:numId w:val="3"/>
-        </w:numPr>
-        <w:tabs>
-          <w:tab w:val="left" w:pos="7230"/>
-        </w:tabs>
-        <w:rPr>
-          <w:sz w:val="22"/>
-          <w:szCs w:val="22"/>
-        </w:rPr>
-      </w:pPr>
-      <w:r>
-        <w:rPr>
-          <w:sz w:val="22"/>
-          <w:szCs w:val="22"/>
-        </w:rPr>
-        <w:t>Centr</w:t>
-      </w:r>
-      <w:r>
-        <w:rPr>
-          <w:rFonts w:hint="cs"/>
-          <w:sz w:val="22"/>
-          <w:szCs w:val="22"/>
-        </w:rPr>
-        <w:t>é</w:t>
-      </w:r>
-      <w:r>
-        <w:rPr>
-          <w:sz w:val="22"/>
-          <w:szCs w:val="22"/>
-        </w:rPr>
-        <w:t>e sur la s</w:t>
-      </w:r>
-      <w:r>
-        <w:rPr>
-          <w:rFonts w:hint="cs"/>
-          <w:sz w:val="22"/>
-          <w:szCs w:val="22"/>
-        </w:rPr>
-        <w:t>é</w:t>
-      </w:r>
-      <w:r>
-        <w:rPr>
-          <w:sz w:val="22"/>
-          <w:szCs w:val="22"/>
-        </w:rPr>
-        <w:t>curit</w:t>
-      </w:r>
-      <w:r>
-        <w:rPr>
-          <w:rFonts w:hint="cs"/>
-          <w:sz w:val="22"/>
-          <w:szCs w:val="22"/>
-        </w:rPr>
-        <w:t>é</w:t>
-      </w:r>
-      <w:r>
-        <w:rPr>
-          <w:sz w:val="22"/>
-          <w:szCs w:val="22"/>
-        </w:rPr>
-        <w:t xml:space="preserve"> applicative (selon l</w:t>
-      </w:r>
-      <w:r>
-        <w:rPr>
-          <w:rFonts w:hint="cs"/>
-          <w:sz w:val="22"/>
-          <w:szCs w:val="22"/>
-        </w:rPr>
-        <w:t>’</w:t>
-      </w:r>
-      <w:r>
-        <w:rPr>
-          <w:sz w:val="22"/>
-          <w:szCs w:val="22"/>
-        </w:rPr>
-        <w:t>OWASP Top 10) et l</w:t>
-      </w:r>
-      <w:r>
-        <w:rPr>
-          <w:rFonts w:hint="cs"/>
-          <w:sz w:val="22"/>
-          <w:szCs w:val="22"/>
-        </w:rPr>
-        <w:t>’</w:t>
-      </w:r>
-      <w:r>
-        <w:rPr>
-          <w:sz w:val="22"/>
-          <w:szCs w:val="22"/>
-        </w:rPr>
-        <w:t xml:space="preserve">architecture propre. </w:t>
       </w:r>
     </w:p>
     <w:p>
@@ -2477,17 +2445,85 @@
           <w:tab w:val="left" w:pos="7230"/>
         </w:tabs>
         <w:spacing w:line="276" w:lineRule="auto"/>
-        <w:rPr>
-          <w:sz w:val="22"/>
-          <w:szCs w:val="22"/>
-        </w:rPr>
-      </w:pPr>
-      <w:r>
-        <w:rPr>
-          <w:sz w:val="22"/>
-          <w:szCs w:val="22"/>
-        </w:rPr>
-        <w:t>Autowiring, typage strict, CI/CD, tests multi-niveaux.</w:t>
+        <w:ind w:left="357" w:hanging="357"/>
+        <w:rPr>
+          <w:sz w:val="22"/>
+          <w:szCs w:val="22"/>
+        </w:rPr>
+      </w:pPr>
+      <w:r>
+        <w:rPr>
+          <w:sz w:val="22"/>
+          <w:szCs w:val="22"/>
+        </w:rPr>
+        <w:t>D</w:t>
+      </w:r>
+      <w:r>
+        <w:rPr>
+          <w:sz w:val="22"/>
+          <w:szCs w:val="22"/>
+        </w:rPr>
+        <w:t>esign patterns avanc</w:t>
+      </w:r>
+      <w:r>
+        <w:rPr>
+          <w:rFonts w:hint="cs"/>
+          <w:sz w:val="22"/>
+          <w:szCs w:val="22"/>
+        </w:rPr>
+        <w:t>é</w:t>
+      </w:r>
+      <w:r>
+        <w:rPr>
+          <w:sz w:val="22"/>
+          <w:szCs w:val="22"/>
+        </w:rPr>
+        <w:t xml:space="preserve">s : Ports &amp; </w:t>
+      </w:r>
+      <w:proofErr w:type="spellStart"/>
+      <w:r>
+        <w:rPr>
+          <w:sz w:val="22"/>
+          <w:szCs w:val="22"/>
+        </w:rPr>
+        <w:t>Adapters</w:t>
+      </w:r>
+      <w:proofErr w:type="spellEnd"/>
+      <w:r>
+        <w:rPr>
+          <w:sz w:val="22"/>
+          <w:szCs w:val="22"/>
+        </w:rPr>
+        <w:t>, Command Bus et injection de d</w:t>
+      </w:r>
+      <w:r>
+        <w:rPr>
+          <w:rFonts w:hint="cs"/>
+          <w:sz w:val="22"/>
+          <w:szCs w:val="22"/>
+        </w:rPr>
+        <w:t>é</w:t>
+      </w:r>
+      <w:r>
+        <w:rPr>
+          <w:sz w:val="22"/>
+          <w:szCs w:val="22"/>
+        </w:rPr>
+        <w:t>pendance</w:t>
+      </w:r>
+      <w:r>
+        <w:rPr>
+          <w:sz w:val="22"/>
+          <w:szCs w:val="22"/>
+        </w:rPr>
+        <w:t>s</w:t>
+      </w:r>
+      <w:r>
+        <w:rPr>
+          <w:sz w:val="22"/>
+          <w:szCs w:val="22"/>
+        </w:rPr>
+        <w:t>.</w:t>
       </w:r>
     </w:p>
     <w:p>
@@ -2588,7 +2624,28 @@
           <w:sz w:val="22"/>
           <w:szCs w:val="22"/>
         </w:rPr>
-        <w:t>Rust, Python, PHP, C++, Java, Shell.</w:t>
+        <w:t xml:space="preserve">Rust, </w:t>
+      </w:r>
+      <w:r>
+        <w:rPr>
+          <w:sz w:val="22"/>
+          <w:szCs w:val="22"/>
+        </w:rPr>
+        <w:t>C++</w:t>
+      </w:r>
+      <w:r>
+        <w:rPr>
+          <w:sz w:val="22"/>
+          <w:szCs w:val="22"/>
+        </w:rPr>
+        <w:t xml:space="preserve">, </w:t>
+      </w:r>
+      <w:r>
+        <w:rPr>
+          <w:sz w:val="22"/>
+          <w:szCs w:val="22"/>
+        </w:rPr>
+        <w:t>Python, PHP, Java, Shell.</w:t>
       </w:r>
       <w:r>
         <w:rPr>
@@ -2661,14 +2718,58 @@
           <w:sz w:val="22"/>
           <w:szCs w:val="22"/>
         </w:rPr>
-        <w:t>Architecture Hexagonale, CQS, Design Patterns, Micro-services</w:t>
-      </w:r>
-      <w:r>
-        <w:rPr>
-          <w:sz w:val="22"/>
-          <w:szCs w:val="22"/>
-        </w:rPr>
-        <w:t>, Programmation concurrente &amp; Multithreading.</w:t>
+        <w:t>Architecture Hexagonale, CQS, Design Patterns,</w:t>
+      </w:r>
+      <w:r>
+        <w:rPr>
+          <w:sz w:val="22"/>
+          <w:szCs w:val="22"/>
+        </w:rPr>
+        <w:t xml:space="preserve"> UML, </w:t>
+      </w:r>
+      <w:proofErr w:type="spellStart"/>
+      <w:r>
+        <w:rPr>
+          <w:sz w:val="22"/>
+          <w:szCs w:val="22"/>
+        </w:rPr>
+        <w:t>SysML</w:t>
+      </w:r>
+      <w:proofErr w:type="spellEnd"/>
+      <w:r>
+        <w:rPr>
+          <w:sz w:val="22"/>
+          <w:szCs w:val="22"/>
+        </w:rPr>
+        <w:t>,</w:t>
+      </w:r>
+      <w:r>
+        <w:rPr>
+          <w:sz w:val="22"/>
+          <w:szCs w:val="22"/>
+        </w:rPr>
+        <w:t xml:space="preserve"> Micro-services</w:t>
+      </w:r>
+      <w:r>
+        <w:rPr>
+          <w:sz w:val="22"/>
+          <w:szCs w:val="22"/>
+        </w:rPr>
+        <w:t xml:space="preserve">, </w:t>
+      </w:r>
+      <w:r>
+        <w:rPr>
+          <w:sz w:val="22"/>
+          <w:szCs w:val="22"/>
+        </w:rPr>
+        <w:t xml:space="preserve">Systèmes Critiques, </w:t>
+      </w:r>
+      <w:r>
+        <w:rPr>
+          <w:sz w:val="22"/>
+          <w:szCs w:val="22"/>
+        </w:rPr>
+        <w:t>Programmation concurrente &amp; Multithreading.</w:t>
       </w:r>
     </w:p>
     <w:p>
@@ -2727,7 +2828,51 @@
           <w:sz w:val="22"/>
           <w:szCs w:val="22"/>
         </w:rPr>
-        <w:t>Linux, Git, Docker, CI/CD, VirtualBox.</w:t>
+        <w:t>Linux,</w:t>
+      </w:r>
+      <w:r>
+        <w:rPr>
+          <w:sz w:val="22"/>
+          <w:szCs w:val="22"/>
+        </w:rPr>
+        <w:t xml:space="preserve"> WSL,</w:t>
+      </w:r>
+      <w:r>
+        <w:rPr>
+          <w:sz w:val="22"/>
+          <w:szCs w:val="22"/>
+        </w:rPr>
+        <w:t xml:space="preserve"> Git, Docker, CI/CD,</w:t>
+      </w:r>
+      <w:r>
+        <w:rPr>
+          <w:sz w:val="22"/>
+          <w:szCs w:val="22"/>
+        </w:rPr>
+        <w:t xml:space="preserve"> </w:t>
+      </w:r>
+      <w:proofErr w:type="spellStart"/>
+      <w:r>
+        <w:rPr>
+          <w:sz w:val="22"/>
+          <w:szCs w:val="22"/>
+        </w:rPr>
+        <w:t>Gitlab</w:t>
+      </w:r>
+      <w:proofErr w:type="spellEnd"/>
+      <w:r>
+        <w:rPr>
+          <w:sz w:val="22"/>
+          <w:szCs w:val="22"/>
+        </w:rPr>
+        <w:t>,</w:t>
+      </w:r>
+      <w:r>
+        <w:rPr>
+          <w:sz w:val="22"/>
+          <w:szCs w:val="22"/>
+        </w:rPr>
+        <w:t xml:space="preserve"> VirtualBox.</w:t>
       </w:r>
     </w:p>
     <w:p>
@@ -2871,7 +3016,21 @@
           <w:sz w:val="22"/>
           <w:szCs w:val="22"/>
         </w:rPr>
-        <w:t xml:space="preserve"> applicative (OWASP Top 10), SSH.</w:t>
+        <w:t xml:space="preserve"> applicative (OWASP Top 10), </w:t>
+      </w:r>
+      <w:r>
+        <w:rPr>
+          <w:sz w:val="22"/>
+          <w:szCs w:val="22"/>
+        </w:rPr>
+        <w:t xml:space="preserve">SSI, </w:t>
+      </w:r>
+      <w:r>
+        <w:rPr>
+          <w:sz w:val="22"/>
+          <w:szCs w:val="22"/>
+        </w:rPr>
+        <w:t>SSH.</w:t>
       </w:r>
     </w:p>
     <w:p>
@@ -4897,6 +5056,27 @@
 </file>
 
 <file path=customXml/item1.xml><?xml version="1.0" encoding="utf-8"?>
+<b:Sources xmlns:b="http://schemas.openxmlformats.org/officeDocument/2006/bibliography" xmlns="http://schemas.openxmlformats.org/officeDocument/2006/bibliography" SelectedStyle="\APASixthEditionOfficeOnline.xsl" StyleName="APA" Version="6"/>
+</file>
+
+<file path=customXml/item2.xml><?xml version="1.0" encoding="utf-8"?>
+<p:properties xmlns:p="http://schemas.microsoft.com/office/2006/metadata/properties" xmlns:xsi="http://www.w3.org/2001/XMLSchema-instance" xmlns:pc="http://schemas.microsoft.com/office/infopath/2007/PartnerControls">
+  <documentManagement>
+    <_activity xmlns="bae72e62-6759-4294-9637-30cbb1062e07" xsi:nil="true"/>
+  </documentManagement>
+</p:properties>
+</file>
+
+<file path=customXml/item3.xml><?xml version="1.0" encoding="utf-8"?>
+<?mso-contentType ?>
+<FormTemplates xmlns="http://schemas.microsoft.com/sharepoint/v3/contenttype/forms">
+  <Display>DocumentLibraryForm</Display>
+  <Edit>DocumentLibraryForm</Edit>
+  <New>DocumentLibraryForm</New>
+</FormTemplates>
+</file>
+
+<file path=customXml/item4.xml><?xml version="1.0" encoding="utf-8"?>
 <ct:contentTypeSchema xmlns:ct="http://schemas.microsoft.com/office/2006/metadata/contentType" xmlns:ma="http://schemas.microsoft.com/office/2006/metadata/properties/metaAttributes" ct:_="" ma:_="" ma:contentTypeName="Document" ma:contentTypeID="0x010100F4AF089949EF6248B5A8B42ADA189840" ma:contentTypeVersion="6" ma:contentTypeDescription="Crée un document." ma:contentTypeScope="" ma:versionID="21a06db2f4f814c07c400eccb1452403">
   <xsd:schema xmlns:xsd="http://www.w3.org/2001/XMLSchema" xmlns:xs="http://www.w3.org/2001/XMLSchema" xmlns:p="http://schemas.microsoft.com/office/2006/metadata/properties" xmlns:ns3="bae72e62-6759-4294-9637-30cbb1062e07" targetNamespace="http://schemas.microsoft.com/office/2006/metadata/properties" ma:root="true" ma:fieldsID="741b38e23a83afcd8d0feb85f6d21593" ns3:_="">
     <xsd:import namespace="bae72e62-6759-4294-9637-30cbb1062e07"/>
@@ -5052,28 +5232,33 @@
 </ct:contentTypeSchema>
 </file>
 
-<file path=customXml/item2.xml><?xml version="1.0" encoding="utf-8"?>
-<b:Sources xmlns:b="http://schemas.openxmlformats.org/officeDocument/2006/bibliography" xmlns="http://schemas.openxmlformats.org/officeDocument/2006/bibliography" SelectedStyle="\APASixthEditionOfficeOnline.xsl" StyleName="APA" Version="6"/>
+<file path=customXml/itemProps1.xml><?xml version="1.0" encoding="utf-8"?>
+<ds:datastoreItem xmlns:ds="http://schemas.openxmlformats.org/officeDocument/2006/customXml" ds:itemID="{B296BADF-A979-4ACF-8D90-76314F75820D}">
+  <ds:schemaRefs>
+    <ds:schemaRef ds:uri="http://schemas.openxmlformats.org/officeDocument/2006/bibliography"/>
+  </ds:schemaRefs>
+</ds:datastoreItem>
 </file>
 
-<file path=customXml/item3.xml><?xml version="1.0" encoding="utf-8"?>
-<p:properties xmlns:p="http://schemas.microsoft.com/office/2006/metadata/properties" xmlns:xsi="http://www.w3.org/2001/XMLSchema-instance" xmlns:pc="http://schemas.microsoft.com/office/infopath/2007/PartnerControls">
-  <documentManagement>
-    <_activity xmlns="bae72e62-6759-4294-9637-30cbb1062e07" xsi:nil="true"/>
-  </documentManagement>
-</p:properties>
+<file path=customXml/itemProps2.xml><?xml version="1.0" encoding="utf-8"?>
+<ds:datastoreItem xmlns:ds="http://schemas.openxmlformats.org/officeDocument/2006/customXml" ds:itemID="{8D86E38E-55F1-455C-87A8-0C351C1C7F87}">
+  <ds:schemaRefs>
+    <ds:schemaRef ds:uri="http://schemas.microsoft.com/office/2006/metadata/properties"/>
+    <ds:schemaRef ds:uri="http://schemas.microsoft.com/office/infopath/2007/PartnerControls"/>
+    <ds:schemaRef ds:uri="bae72e62-6759-4294-9637-30cbb1062e07"/>
+  </ds:schemaRefs>
+</ds:datastoreItem>
 </file>
 
-<file path=customXml/item4.xml><?xml version="1.0" encoding="utf-8"?>
-<?mso-contentType ?>
-<FormTemplates xmlns="http://schemas.microsoft.com/sharepoint/v3/contenttype/forms">
-  <Display>DocumentLibraryForm</Display>
-  <Edit>DocumentLibraryForm</Edit>
-  <New>DocumentLibraryForm</New>
-</FormTemplates>
+<file path=customXml/itemProps3.xml><?xml version="1.0" encoding="utf-8"?>
+<ds:datastoreItem xmlns:ds="http://schemas.openxmlformats.org/officeDocument/2006/customXml" ds:itemID="{16AD5083-A7B5-486E-9703-B8835E30E7EC}">
+  <ds:schemaRefs>
+    <ds:schemaRef ds:uri="http://schemas.microsoft.com/sharepoint/v3/contenttype/forms"/>
+  </ds:schemaRefs>
+</ds:datastoreItem>
 </file>
 
-<file path=customXml/itemProps1.xml><?xml version="1.0" encoding="utf-8"?>
+<file path=customXml/itemProps4.xml><?xml version="1.0" encoding="utf-8"?>
 <ds:datastoreItem xmlns:ds="http://schemas.openxmlformats.org/officeDocument/2006/customXml" ds:itemID="{C840A1DC-2F68-47F5-8A0C-FB3FCC5B717E}">
   <ds:schemaRefs>
     <ds:schemaRef ds:uri="http://schemas.microsoft.com/office/2006/metadata/contentType"/>
@@ -5089,30 +5274,4 @@
     <ds:schemaRef ds:uri="http://schemas.microsoft.com/internal/obd"/>
   </ds:schemaRefs>
 </ds:datastoreItem>
-</file>
-
-<file path=customXml/itemProps2.xml><?xml version="1.0" encoding="utf-8"?>
-<ds:datastoreItem xmlns:ds="http://schemas.openxmlformats.org/officeDocument/2006/customXml" ds:itemID="{B296BADF-A979-4ACF-8D90-76314F75820D}">
-  <ds:schemaRefs>
-    <ds:schemaRef ds:uri="http://schemas.openxmlformats.org/officeDocument/2006/bibliography"/>
-  </ds:schemaRefs>
-</ds:datastoreItem>
-</file>
-
-<file path=customXml/itemProps3.xml><?xml version="1.0" encoding="utf-8"?>
-<ds:datastoreItem xmlns:ds="http://schemas.openxmlformats.org/officeDocument/2006/customXml" ds:itemID="{8D86E38E-55F1-455C-87A8-0C351C1C7F87}">
-  <ds:schemaRefs>
-    <ds:schemaRef ds:uri="http://schemas.microsoft.com/office/2006/metadata/properties"/>
-    <ds:schemaRef ds:uri="http://schemas.microsoft.com/office/infopath/2007/PartnerControls"/>
-    <ds:schemaRef ds:uri="bae72e62-6759-4294-9637-30cbb1062e07"/>
-  </ds:schemaRefs>
-</ds:datastoreItem>
-</file>
-
-<file path=customXml/itemProps4.xml><?xml version="1.0" encoding="utf-8"?>
-<ds:datastoreItem xmlns:ds="http://schemas.openxmlformats.org/officeDocument/2006/customXml" ds:itemID="{16AD5083-A7B5-486E-9703-B8835E30E7EC}">
-  <ds:schemaRefs>
-    <ds:schemaRef ds:uri="http://schemas.microsoft.com/sharepoint/v3/contenttype/forms"/>
-  </ds:schemaRefs>
-</ds:datastoreItem>
 </file>
</xml_diff>